<commit_message>
Separate ZipGrade question papers and double-sided A5 essay sheets
</commit_message>
<xml_diff>
--- a/frontend/templates/Revision-Unit-7-Group-213-ZipGrade.docx
+++ b/frontend/templates/Revision-Unit-7-Group-213-ZipGrade.docx
@@ -13,31 +13,11 @@
     <w:p>
       <w:r>
         <w:t>Group 213 · Test Version A</w:t>
-        <w:br/>
-        <w:t>Name: __________________________________     Date: __________________</w:t>
       </w:r>
     </w:p>
     <w:p>
       <w:r>
-        <w:t>For questions 1–20, choose ONE best answer and shade A, B, C, D or E on the separate ZipGrade answer sheet. Do not write MCQ answers on this question paper. Check the question numbers carefully. Fill in your name and group (Period). Select Version A if using that field. Write the essay on the lined pages.</w:t>
-      </w:r>
-    </w:p>
-    <w:p>
-      <w:pPr>
-        <w:pStyle w:val="Heading2"/>
-      </w:pPr>
-      <w:r>
-        <w:t>Optional research participation</w:t>
-      </w:r>
-    </w:p>
-    <w:p>
-      <w:r>
-        <w:t>This test is also part of a vocabulary-learning study. With your agreement, your answers, scores and essay may be analysed for research. Your name is retained for teacher assessment; research reporting should not identify you. Participation is voluntary and declining has no effect on your grade. You may ask your teacher to withdraw your research data before anonymisation. No electronic response times are collected in this paper version.</w:t>
-      </w:r>
-    </w:p>
-    <w:p>
-      <w:r>
-        <w:t>Choose one: ☐ I agree to participate.  ☐ I will take the test without participating in the research.</w:t>
+        <w:t>For questions 1–20, choose ONE best answer and shade A, B, C, D or E on the separate ZipGrade answer sheet. Do not write MCQ answers on this question paper. Check the question numbers carefully. Fill in your name and group (Period). Select Version A if using that field. Write the essay on the separate double-sided essay sheet. Record your research participation choice on that sheet.</w:t>
       </w:r>
     </w:p>
     <w:p>
@@ -989,291 +969,7 @@
     </w:p>
     <w:p>
       <w:r>
-        <w:t>Write your answer below and on the next page. Word count: __________</w:t>
-      </w:r>
-    </w:p>
-    <w:p>
-      <w:r>
-        <w:t>________________________________________________________________________</w:t>
-      </w:r>
-    </w:p>
-    <w:p>
-      <w:r>
-        <w:t>________________________________________________________________________</w:t>
-      </w:r>
-    </w:p>
-    <w:p>
-      <w:r>
-        <w:t>________________________________________________________________________</w:t>
-      </w:r>
-    </w:p>
-    <w:p>
-      <w:r>
-        <w:t>________________________________________________________________________</w:t>
-      </w:r>
-    </w:p>
-    <w:p>
-      <w:r>
-        <w:t>________________________________________________________________________</w:t>
-      </w:r>
-    </w:p>
-    <w:p>
-      <w:r>
-        <w:t>________________________________________________________________________</w:t>
-      </w:r>
-    </w:p>
-    <w:p>
-      <w:r>
-        <w:t>________________________________________________________________________</w:t>
-      </w:r>
-    </w:p>
-    <w:p>
-      <w:r>
-        <w:t>________________________________________________________________________</w:t>
-      </w:r>
-    </w:p>
-    <w:p>
-      <w:r>
-        <w:t>________________________________________________________________________</w:t>
-      </w:r>
-    </w:p>
-    <w:p>
-      <w:r>
-        <w:t>________________________________________________________________________</w:t>
-      </w:r>
-    </w:p>
-    <w:p>
-      <w:r>
-        <w:br w:type="page"/>
-      </w:r>
-    </w:p>
-    <w:p>
-      <w:pPr>
-        <w:pStyle w:val="Heading1"/>
-      </w:pPr>
-      <w:r>
-        <w:t>Essay · continued</w:t>
-      </w:r>
-    </w:p>
-    <w:p>
-      <w:r>
-        <w:t>Group 213    Name: ______________________________________________</w:t>
-      </w:r>
-    </w:p>
-    <w:p>
-      <w:pPr>
-        <w:spacing w:after="80"/>
-      </w:pPr>
-      <w:r>
-        <w:t>________________________________________________________________________</w:t>
-      </w:r>
-    </w:p>
-    <w:p>
-      <w:pPr>
-        <w:spacing w:after="80"/>
-      </w:pPr>
-      <w:r>
-        <w:t>________________________________________________________________________</w:t>
-      </w:r>
-    </w:p>
-    <w:p>
-      <w:pPr>
-        <w:spacing w:after="80"/>
-      </w:pPr>
-      <w:r>
-        <w:t>________________________________________________________________________</w:t>
-      </w:r>
-    </w:p>
-    <w:p>
-      <w:pPr>
-        <w:spacing w:after="80"/>
-      </w:pPr>
-      <w:r>
-        <w:t>________________________________________________________________________</w:t>
-      </w:r>
-    </w:p>
-    <w:p>
-      <w:pPr>
-        <w:spacing w:after="80"/>
-      </w:pPr>
-      <w:r>
-        <w:t>________________________________________________________________________</w:t>
-      </w:r>
-    </w:p>
-    <w:p>
-      <w:pPr>
-        <w:spacing w:after="80"/>
-      </w:pPr>
-      <w:r>
-        <w:t>________________________________________________________________________</w:t>
-      </w:r>
-    </w:p>
-    <w:p>
-      <w:pPr>
-        <w:spacing w:after="80"/>
-      </w:pPr>
-      <w:r>
-        <w:t>________________________________________________________________________</w:t>
-      </w:r>
-    </w:p>
-    <w:p>
-      <w:pPr>
-        <w:spacing w:after="80"/>
-      </w:pPr>
-      <w:r>
-        <w:t>________________________________________________________________________</w:t>
-      </w:r>
-    </w:p>
-    <w:p>
-      <w:pPr>
-        <w:spacing w:after="80"/>
-      </w:pPr>
-      <w:r>
-        <w:t>________________________________________________________________________</w:t>
-      </w:r>
-    </w:p>
-    <w:p>
-      <w:pPr>
-        <w:spacing w:after="80"/>
-      </w:pPr>
-      <w:r>
-        <w:t>________________________________________________________________________</w:t>
-      </w:r>
-    </w:p>
-    <w:p>
-      <w:pPr>
-        <w:spacing w:after="80"/>
-      </w:pPr>
-      <w:r>
-        <w:t>________________________________________________________________________</w:t>
-      </w:r>
-    </w:p>
-    <w:p>
-      <w:pPr>
-        <w:spacing w:after="80"/>
-      </w:pPr>
-      <w:r>
-        <w:t>________________________________________________________________________</w:t>
-      </w:r>
-    </w:p>
-    <w:p>
-      <w:pPr>
-        <w:spacing w:after="80"/>
-      </w:pPr>
-      <w:r>
-        <w:t>________________________________________________________________________</w:t>
-      </w:r>
-    </w:p>
-    <w:p>
-      <w:pPr>
-        <w:spacing w:after="80"/>
-      </w:pPr>
-      <w:r>
-        <w:t>________________________________________________________________________</w:t>
-      </w:r>
-    </w:p>
-    <w:p>
-      <w:pPr>
-        <w:spacing w:after="80"/>
-      </w:pPr>
-      <w:r>
-        <w:t>________________________________________________________________________</w:t>
-      </w:r>
-    </w:p>
-    <w:p>
-      <w:pPr>
-        <w:spacing w:after="80"/>
-      </w:pPr>
-      <w:r>
-        <w:t>________________________________________________________________________</w:t>
-      </w:r>
-    </w:p>
-    <w:p>
-      <w:pPr>
-        <w:spacing w:after="80"/>
-      </w:pPr>
-      <w:r>
-        <w:t>________________________________________________________________________</w:t>
-      </w:r>
-    </w:p>
-    <w:p>
-      <w:pPr>
-        <w:spacing w:after="80"/>
-      </w:pPr>
-      <w:r>
-        <w:t>________________________________________________________________________</w:t>
-      </w:r>
-    </w:p>
-    <w:p>
-      <w:pPr>
-        <w:spacing w:after="80"/>
-      </w:pPr>
-      <w:r>
-        <w:t>________________________________________________________________________</w:t>
-      </w:r>
-    </w:p>
-    <w:p>
-      <w:pPr>
-        <w:spacing w:after="80"/>
-      </w:pPr>
-      <w:r>
-        <w:t>________________________________________________________________________</w:t>
-      </w:r>
-    </w:p>
-    <w:p>
-      <w:pPr>
-        <w:spacing w:after="80"/>
-      </w:pPr>
-      <w:r>
-        <w:t>________________________________________________________________________</w:t>
-      </w:r>
-    </w:p>
-    <w:p>
-      <w:pPr>
-        <w:spacing w:after="80"/>
-      </w:pPr>
-      <w:r>
-        <w:t>________________________________________________________________________</w:t>
-      </w:r>
-    </w:p>
-    <w:p>
-      <w:pPr>
-        <w:spacing w:after="80"/>
-      </w:pPr>
-      <w:r>
-        <w:t>________________________________________________________________________</w:t>
-      </w:r>
-    </w:p>
-    <w:p>
-      <w:pPr>
-        <w:spacing w:after="80"/>
-      </w:pPr>
-      <w:r>
-        <w:t>________________________________________________________________________</w:t>
-      </w:r>
-    </w:p>
-    <w:p>
-      <w:pPr>
-        <w:spacing w:after="80"/>
-      </w:pPr>
-      <w:r>
-        <w:t>________________________________________________________________________</w:t>
-      </w:r>
-    </w:p>
-    <w:p>
-      <w:pPr>
-        <w:spacing w:after="80"/>
-      </w:pPr>
-      <w:r>
-        <w:t>________________________________________________________________________</w:t>
-      </w:r>
-    </w:p>
-    <w:p>
-      <w:pPr>
-        <w:spacing w:after="80"/>
-      </w:pPr>
-      <w:r>
-        <w:t>________________________________________________________________________</w:t>
+        <w:t>Write your essay on the separate essay sheet. Do not write on this question paper.</w:t>
       </w:r>
     </w:p>
     <w:sectPr>

</xml_diff>

<commit_message>
Replace lexical recall with contextual recognition online and in paper tests
</commit_message>
<xml_diff>
--- a/frontend/templates/Revision-Unit-7-Group-213-ZipGrade.docx
+++ b/frontend/templates/Revision-Unit-7-Group-213-ZipGrade.docx
@@ -7,7 +7,7 @@
         <w:pStyle w:val="Title"/>
       </w:pPr>
       <w:r>
-        <w:t>Revision Test · Evolve 6 · Unit 7</w:t>
+        <w:t>RT1 · Evolve 6 · Unit 7</w:t>
       </w:r>
     </w:p>
     <w:p>
@@ -30,7 +30,7 @@
     </w:p>
     <w:p>
       <w:r>
-        <w:t>1. The museum preserves stories, rituals and objects passed down through the community. Together they represent its cultural ___.</w:t>
+        <w:t>1. Elena discovered that her great-great-grandfather moved abroad in 1820. Which statement describes the discovery accurately?</w:t>
       </w:r>
     </w:p>
     <w:p>
@@ -38,7 +38,101 @@
         <w:spacing w:after="20"/>
       </w:pPr>
       <w:r>
-        <w:t>A. ethnicity</w:t>
+        <w:t>A. She discovered her present-day citizenship.</w:t>
+      </w:r>
+    </w:p>
+    <w:p>
+      <w:pPr>
+        <w:spacing w:after="20"/>
+      </w:pPr>
+      <w:r>
+        <w:t>B. She discovered who would inherit her possessions.</w:t>
+      </w:r>
+    </w:p>
+    <w:p>
+      <w:pPr>
+        <w:spacing w:after="20"/>
+      </w:pPr>
+      <w:r>
+        <w:t>C. She learned where one of her descendants had lived.</w:t>
+      </w:r>
+    </w:p>
+    <w:p>
+      <w:pPr>
+        <w:spacing w:after="20"/>
+      </w:pPr>
+      <w:r>
+        <w:t>D. She learned where one of her ancestors had lived.</w:t>
+      </w:r>
+    </w:p>
+    <w:p>
+      <w:pPr>
+        <w:spacing w:after="20"/>
+      </w:pPr>
+      <w:r>
+        <w:t>E. She identified the parents who had adopted her.</w:t>
+      </w:r>
+    </w:p>
+    <w:p>
+      <w:r>
+        <w:t>2. Choose the expression that best fits the meaning and usage in this context.</w:t>
+        <w:br/>
+        <w:t>The records trace Omar’s family line through several generations. They tell him about his ___, rather than his present-day citizenship.</w:t>
+      </w:r>
+    </w:p>
+    <w:p>
+      <w:pPr>
+        <w:spacing w:after="20"/>
+      </w:pPr>
+      <w:r>
+        <w:t>A. ancestry</w:t>
+      </w:r>
+    </w:p>
+    <w:p>
+      <w:pPr>
+        <w:spacing w:after="20"/>
+      </w:pPr>
+      <w:r>
+        <w:t>B. nationality</w:t>
+      </w:r>
+    </w:p>
+    <w:p>
+      <w:pPr>
+        <w:spacing w:after="20"/>
+      </w:pPr>
+      <w:r>
+        <w:t>C. identity</w:t>
+      </w:r>
+    </w:p>
+    <w:p>
+      <w:pPr>
+        <w:spacing w:after="20"/>
+      </w:pPr>
+      <w:r>
+        <w:t>D. heritage</w:t>
+      </w:r>
+    </w:p>
+    <w:p>
+      <w:pPr>
+        <w:spacing w:after="20"/>
+      </w:pPr>
+      <w:r>
+        <w:t>E. ethnicity</w:t>
+      </w:r>
+    </w:p>
+    <w:p>
+      <w:r>
+        <w:t>3. Choose the expression that best fits the meaning and usage in this context.</w:t>
+        <w:br/>
+        <w:t>Eva checks birth certificates, marriage records and family trees to establish who was related to whom. Her research is in ___, not DNA analysis.</w:t>
+      </w:r>
+    </w:p>
+    <w:p>
+      <w:pPr>
+        <w:spacing w:after="20"/>
+      </w:pPr>
+      <w:r>
+        <w:t>A. anthropology</w:t>
       </w:r>
     </w:p>
     <w:p>
@@ -54,7 +148,7 @@
         <w:spacing w:after="20"/>
       </w:pPr>
       <w:r>
-        <w:t>C. genealogy</w:t>
+        <w:t>C. archaeology</w:t>
       </w:r>
     </w:p>
     <w:p>
@@ -62,7 +156,54 @@
         <w:spacing w:after="20"/>
       </w:pPr>
       <w:r>
-        <w:t>D. heritage</w:t>
+        <w:t>D. genealogy</w:t>
+      </w:r>
+    </w:p>
+    <w:p>
+      <w:pPr>
+        <w:spacing w:after="20"/>
+      </w:pPr>
+      <w:r>
+        <w:t>E. ethnography</w:t>
+      </w:r>
+    </w:p>
+    <w:p>
+      <w:r>
+        <w:t>4. Choose the expression that best fits the meaning and usage in this context.</w:t>
+        <w:br/>
+        <w:t>The survey asks respondents how they identify culturally, separately from where they hold citizenship. That question concerns their ___.</w:t>
+      </w:r>
+    </w:p>
+    <w:p>
+      <w:pPr>
+        <w:spacing w:after="20"/>
+      </w:pPr>
+      <w:r>
+        <w:t>A. citizenship</w:t>
+      </w:r>
+    </w:p>
+    <w:p>
+      <w:pPr>
+        <w:spacing w:after="20"/>
+      </w:pPr>
+      <w:r>
+        <w:t>B. nationality</w:t>
+      </w:r>
+    </w:p>
+    <w:p>
+      <w:pPr>
+        <w:spacing w:after="20"/>
+      </w:pPr>
+      <w:r>
+        <w:t>C. ethnicity</w:t>
+      </w:r>
+    </w:p>
+    <w:p>
+      <w:pPr>
+        <w:spacing w:after="20"/>
+      </w:pPr>
+      <w:r>
+        <w:t>D. residence</w:t>
       </w:r>
     </w:p>
     <w:p>
@@ -75,7 +216,9 @@
     </w:p>
     <w:p>
       <w:r>
-        <w:t>2. Maya traced her family line using birth certificates and parish records rather than analysing a DNA sample. Her research is primarily ___.</w:t>
+        <w:t>5. Choose the expression that best fits the meaning and usage in this context.</w:t>
+        <w:br/>
+        <w:t>The community restored its old meeting hall and recorded traditional songs so that younger residents could learn about their cultural ___.</w:t>
       </w:r>
     </w:p>
     <w:p>
@@ -83,7 +226,7 @@
         <w:spacing w:after="20"/>
       </w:pPr>
       <w:r>
-        <w:t>A. genealogy</w:t>
+        <w:t>A. ethnicity</w:t>
       </w:r>
     </w:p>
     <w:p>
@@ -91,7 +234,7 @@
         <w:spacing w:after="20"/>
       </w:pPr>
       <w:r>
-        <w:t>B. genetics</w:t>
+        <w:t>B. nationality</w:t>
       </w:r>
     </w:p>
     <w:p>
@@ -99,7 +242,7 @@
         <w:spacing w:after="20"/>
       </w:pPr>
       <w:r>
-        <w:t>C. heritage</w:t>
+        <w:t>C. ancestry</w:t>
       </w:r>
     </w:p>
     <w:p>
@@ -107,7 +250,7 @@
         <w:spacing w:after="20"/>
       </w:pPr>
       <w:r>
-        <w:t>D. ethnicity</w:t>
+        <w:t>D. genealogy</w:t>
       </w:r>
     </w:p>
     <w:p>
@@ -115,237 +258,14 @@
         <w:spacing w:after="20"/>
       </w:pPr>
       <w:r>
-        <w:t>E. adoption</w:t>
+        <w:t>E. heritage</w:t>
       </w:r>
     </w:p>
     <w:p>
       <w:r>
-        <w:t>3. A report estimates 12%, but explains that the true value may fall within a range. That uncertainty is described by its ___.</w:t>
-      </w:r>
-    </w:p>
-    <w:p>
-      <w:pPr>
-        <w:spacing w:after="20"/>
-      </w:pPr>
-      <w:r>
-        <w:t>A. bright-line distinction</w:t>
-      </w:r>
-    </w:p>
-    <w:p>
-      <w:pPr>
-        <w:spacing w:after="20"/>
-      </w:pPr>
-      <w:r>
-        <w:t>B. trace percentage</w:t>
-      </w:r>
-    </w:p>
-    <w:p>
-      <w:pPr>
-        <w:spacing w:after="20"/>
-      </w:pPr>
-      <w:r>
-        <w:t>C. reference population</w:t>
-      </w:r>
-    </w:p>
-    <w:p>
-      <w:pPr>
-        <w:spacing w:after="20"/>
-      </w:pPr>
-      <w:r>
-        <w:t>D. margin of error</w:t>
-      </w:r>
-    </w:p>
-    <w:p>
-      <w:pPr>
-        <w:spacing w:after="20"/>
-      </w:pPr>
-      <w:r>
-        <w:t>E. genetic marker</w:t>
-      </w:r>
-    </w:p>
-    <w:p>
-      <w:r>
-        <w:t>4. The festival had almost disappeared. Organisers hope that involving younger residents will ___ it, giving it new energy.</w:t>
-      </w:r>
-    </w:p>
-    <w:p>
-      <w:pPr>
-        <w:spacing w:after="20"/>
-      </w:pPr>
-      <w:r>
-        <w:t>A. inherit</w:t>
-      </w:r>
-    </w:p>
-    <w:p>
-      <w:pPr>
-        <w:spacing w:after="20"/>
-      </w:pPr>
-      <w:r>
-        <w:t>B. essentialize</w:t>
-      </w:r>
-    </w:p>
-    <w:p>
-      <w:pPr>
-        <w:spacing w:after="20"/>
-      </w:pPr>
-      <w:r>
-        <w:t>C. reinvigorate</w:t>
-      </w:r>
-    </w:p>
-    <w:p>
-      <w:pPr>
-        <w:spacing w:after="20"/>
-      </w:pPr>
-      <w:r>
-        <w:t>D. symbolize</w:t>
-      </w:r>
-    </w:p>
-    <w:p>
-      <w:pPr>
-        <w:spacing w:after="20"/>
-      </w:pPr>
-      <w:r>
-        <w:t>E. overindulge</w:t>
-      </w:r>
-    </w:p>
-    <w:p>
-      <w:r>
-        <w:t>5. The speech made listeners recognise an experience from their own lives. It struck a ___ with the audience.</w:t>
-      </w:r>
-    </w:p>
-    <w:p>
-      <w:pPr>
-        <w:spacing w:after="20"/>
-      </w:pPr>
-      <w:r>
-        <w:t>A. marker</w:t>
-      </w:r>
-    </w:p>
-    <w:p>
-      <w:pPr>
-        <w:spacing w:after="20"/>
-      </w:pPr>
-      <w:r>
-        <w:t>B. relic</w:t>
-      </w:r>
-    </w:p>
-    <w:p>
-      <w:pPr>
-        <w:spacing w:after="20"/>
-      </w:pPr>
-      <w:r>
-        <w:t>C. beacon</w:t>
-      </w:r>
-    </w:p>
-    <w:p>
-      <w:pPr>
-        <w:spacing w:after="20"/>
-      </w:pPr>
-      <w:r>
-        <w:t>D. rite</w:t>
-      </w:r>
-    </w:p>
-    <w:p>
-      <w:pPr>
-        <w:spacing w:after="20"/>
-      </w:pPr>
-      <w:r>
-        <w:t>E. chord</w:t>
-      </w:r>
-    </w:p>
-    <w:p>
-      <w:r>
-        <w:t>6. The ceremony publicly recognises older community members and their contribution. It pays ___ to the elders.</w:t>
-      </w:r>
-    </w:p>
-    <w:p>
-      <w:pPr>
-        <w:spacing w:after="20"/>
-      </w:pPr>
-      <w:r>
-        <w:t>A. tribute</w:t>
-      </w:r>
-    </w:p>
-    <w:p>
-      <w:pPr>
-        <w:spacing w:after="20"/>
-      </w:pPr>
-      <w:r>
-        <w:t>B. significance</w:t>
-      </w:r>
-    </w:p>
-    <w:p>
-      <w:pPr>
-        <w:spacing w:after="20"/>
-      </w:pPr>
-      <w:r>
-        <w:t>C. friction</w:t>
-      </w:r>
-    </w:p>
-    <w:p>
-      <w:pPr>
-        <w:spacing w:after="20"/>
-      </w:pPr>
-      <w:r>
-        <w:t>D. ancestry</w:t>
-      </w:r>
-    </w:p>
-    <w:p>
-      <w:pPr>
-        <w:spacing w:after="20"/>
-      </w:pPr>
-      <w:r>
-        <w:t>E. practice</w:t>
-      </w:r>
-    </w:p>
-    <w:p>
-      <w:r>
-        <w:t>7. Two families try to remain close despite differences in their customs. Regular shared meals help them ___.</w:t>
-      </w:r>
-    </w:p>
-    <w:p>
-      <w:pPr>
-        <w:spacing w:after="20"/>
-      </w:pPr>
-      <w:r>
-        <w:t>A. essentialize</w:t>
-      </w:r>
-    </w:p>
-    <w:p>
-      <w:pPr>
-        <w:spacing w:after="20"/>
-      </w:pPr>
-      <w:r>
-        <w:t>B. bond</w:t>
-      </w:r>
-    </w:p>
-    <w:p>
-      <w:pPr>
-        <w:spacing w:after="20"/>
-      </w:pPr>
-      <w:r>
-        <w:t>C. choreograph</w:t>
-      </w:r>
-    </w:p>
-    <w:p>
-      <w:pPr>
-        <w:spacing w:after="20"/>
-      </w:pPr>
-      <w:r>
-        <w:t>D. inherit</w:t>
-      </w:r>
-    </w:p>
-    <w:p>
-      <w:pPr>
-        <w:spacing w:after="20"/>
-      </w:pPr>
-      <w:r>
-        <w:t>E. overindulge</w:t>
-      </w:r>
-    </w:p>
-    <w:p>
-      <w:r>
-        <w:t>8. People are beginning to abandon the old custom. The local community wants to keep the tradition ___.</w:t>
+        <w:t>6. Choose the expression that best fits the meaning and usage in this context.</w:t>
+        <w:br/>
+        <w:t>After the court completed the legal process, the couple became the child’s ___ parents, with permanent parental rights and responsibilities.</w:t>
       </w:r>
     </w:p>
     <w:p>
@@ -361,7 +281,7 @@
         <w:spacing w:after="20"/>
       </w:pPr>
       <w:r>
-        <w:t>B. ethnic</w:t>
+        <w:t>B. surrogate</w:t>
       </w:r>
     </w:p>
     <w:p>
@@ -369,7 +289,7 @@
         <w:spacing w:after="20"/>
       </w:pPr>
       <w:r>
-        <w:t>C. alive</w:t>
+        <w:t>C. foster</w:t>
       </w:r>
     </w:p>
     <w:p>
@@ -377,7 +297,7 @@
         <w:spacing w:after="20"/>
       </w:pPr>
       <w:r>
-        <w:t>D. genetic</w:t>
+        <w:t>D. biological</w:t>
       </w:r>
     </w:p>
     <w:p>
@@ -385,7 +305,101 @@
         <w:spacing w:after="20"/>
       </w:pPr>
       <w:r>
-        <w:t>E. ambiguous</w:t>
+        <w:t>E. prospective</w:t>
+      </w:r>
+    </w:p>
+    <w:p>
+      <w:r>
+        <w:t>7. Choose the expression that best fits the meaning and usage in this context.</w:t>
+        <w:br/>
+        <w:t>When the speaker described feeling caught between two cultures, many listeners recognised their own experience. Her account struck a ___ with them.</w:t>
+      </w:r>
+    </w:p>
+    <w:p>
+      <w:pPr>
+        <w:spacing w:after="20"/>
+      </w:pPr>
+      <w:r>
+        <w:t>A. rhythm</w:t>
+      </w:r>
+    </w:p>
+    <w:p>
+      <w:pPr>
+        <w:spacing w:after="20"/>
+      </w:pPr>
+      <w:r>
+        <w:t>B. chord</w:t>
+      </w:r>
+    </w:p>
+    <w:p>
+      <w:pPr>
+        <w:spacing w:after="20"/>
+      </w:pPr>
+      <w:r>
+        <w:t>C. note</w:t>
+      </w:r>
+    </w:p>
+    <w:p>
+      <w:pPr>
+        <w:spacing w:after="20"/>
+      </w:pPr>
+      <w:r>
+        <w:t>D. harmony</w:t>
+      </w:r>
+    </w:p>
+    <w:p>
+      <w:pPr>
+        <w:spacing w:after="20"/>
+      </w:pPr>
+      <w:r>
+        <w:t>E. tone</w:t>
+      </w:r>
+    </w:p>
+    <w:p>
+      <w:r>
+        <w:t>8. Choose the expression that best fits the meaning and usage in this context.</w:t>
+        <w:br/>
+        <w:t>At the ceremony, the younger members paid ___ to the elders who had preserved the language and taught it to others.</w:t>
+      </w:r>
+    </w:p>
+    <w:p>
+      <w:pPr>
+        <w:spacing w:after="20"/>
+      </w:pPr>
+      <w:r>
+        <w:t>A. respect</w:t>
+      </w:r>
+    </w:p>
+    <w:p>
+      <w:pPr>
+        <w:spacing w:after="20"/>
+      </w:pPr>
+      <w:r>
+        <w:t>B. honour</w:t>
+      </w:r>
+    </w:p>
+    <w:p>
+      <w:pPr>
+        <w:spacing w:after="20"/>
+      </w:pPr>
+      <w:r>
+        <w:t>C. tribute</w:t>
+      </w:r>
+    </w:p>
+    <w:p>
+      <w:pPr>
+        <w:spacing w:after="20"/>
+      </w:pPr>
+      <w:r>
+        <w:t>D. homage</w:t>
+      </w:r>
+    </w:p>
+    <w:p>
+      <w:pPr>
+        <w:spacing w:after="20"/>
+      </w:pPr>
+      <w:r>
+        <w:t>E. attention</w:t>
       </w:r>
     </w:p>
     <w:p>
@@ -776,7 +790,9 @@
     </w:p>
     <w:p>
       <w:r>
-        <w:t>17. He refuses to travel on certain dates because he believes they bring bad luck. His attitude is ___.</w:t>
+        <w:t>17. Choose the expression that best fits the meaning and usage in this context.</w:t>
+        <w:br/>
+        <w:t>Leo refuses to open an umbrella indoors because he believes it brings bad luck. Although he knows there is no evidence, he remains ___.</w:t>
       </w:r>
     </w:p>
     <w:p>
@@ -792,7 +808,7 @@
         <w:spacing w:after="20"/>
       </w:pPr>
       <w:r>
-        <w:t>B. hereditary</w:t>
+        <w:t>B. religious</w:t>
       </w:r>
     </w:p>
     <w:p>
@@ -800,7 +816,7 @@
         <w:spacing w:after="20"/>
       </w:pPr>
       <w:r>
-        <w:t>C. obligatory</w:t>
+        <w:t>C. cautious</w:t>
       </w:r>
     </w:p>
     <w:p>
@@ -808,7 +824,7 @@
         <w:spacing w:after="20"/>
       </w:pPr>
       <w:r>
-        <w:t>D. adoptive</w:t>
+        <w:t>D. sceptical</w:t>
       </w:r>
     </w:p>
     <w:p>
@@ -816,12 +832,12 @@
         <w:spacing w:after="20"/>
       </w:pPr>
       <w:r>
-        <w:t>E. compulsory</w:t>
+        <w:t>E. traditional</w:t>
       </w:r>
     </w:p>
     <w:p>
       <w:r>
-        <w:t>18. She believes her family background gave her an advantage before she began her studies. It gave her a ___.</w:t>
+        <w:t>18. Which sentence uses nutmeg accurately?</w:t>
       </w:r>
     </w:p>
     <w:p>
@@ -829,7 +845,7 @@
         <w:spacing w:after="20"/>
       </w:pPr>
       <w:r>
-        <w:t>A. baptism</w:t>
+        <w:t>A. She poured a glass of nutmeg over the salad.</w:t>
       </w:r>
     </w:p>
     <w:p>
@@ -837,7 +853,7 @@
         <w:spacing w:after="20"/>
       </w:pPr>
       <w:r>
-        <w:t>B. second cousin</w:t>
+        <w:t>B. She wore a nutmeg to protect her hands.</w:t>
       </w:r>
     </w:p>
     <w:p>
@@ -845,7 +861,7 @@
         <w:spacing w:after="20"/>
       </w:pPr>
       <w:r>
-        <w:t>C. head start</w:t>
+        <w:t>C. She grated a little nutmeg into the warm milk.</w:t>
       </w:r>
     </w:p>
     <w:p>
@@ -853,7 +869,7 @@
         <w:spacing w:after="20"/>
       </w:pPr>
       <w:r>
-        <w:t>D. tantrum</w:t>
+        <w:t>D. She used nutmeg to describe her family tree.</w:t>
       </w:r>
     </w:p>
     <w:p>
@@ -861,12 +877,14 @@
         <w:spacing w:after="20"/>
       </w:pPr>
       <w:r>
-        <w:t>E. mattress topper</w:t>
+        <w:t>E. She booked a nutmeg to celebrate the festival.</w:t>
       </w:r>
     </w:p>
     <w:p>
       <w:r>
-        <w:t>19. A child becomes furious when a request is refused, shouting and stamping their feet. The child is throwing a ___.</w:t>
+        <w:t>19. Choose the expression that best fits the meaning and usage in this context.</w:t>
+        <w:br/>
+        <w:t>In our local tradition, celebrations continue until ___ on 6 January, when the visit of the Magi is commemorated.</w:t>
       </w:r>
     </w:p>
     <w:p>
@@ -874,7 +892,7 @@
         <w:spacing w:after="20"/>
       </w:pPr>
       <w:r>
-        <w:t>A. demand</w:t>
+        <w:t>A. Easter</w:t>
       </w:r>
     </w:p>
     <w:p>
@@ -882,7 +900,7 @@
         <w:spacing w:after="20"/>
       </w:pPr>
       <w:r>
-        <w:t>B. deed</w:t>
+        <w:t>B. Pentecost</w:t>
       </w:r>
     </w:p>
     <w:p>
@@ -890,7 +908,7 @@
         <w:spacing w:after="20"/>
       </w:pPr>
       <w:r>
-        <w:t>C. head start</w:t>
+        <w:t>C. Christmas</w:t>
       </w:r>
     </w:p>
     <w:p>
@@ -898,7 +916,7 @@
         <w:spacing w:after="20"/>
       </w:pPr>
       <w:r>
-        <w:t>D. predisposition</w:t>
+        <w:t>D. Advent</w:t>
       </w:r>
     </w:p>
     <w:p>
@@ -906,12 +924,14 @@
         <w:spacing w:after="20"/>
       </w:pPr>
       <w:r>
-        <w:t>E. tantrum</w:t>
+        <w:t>E. Epiphany</w:t>
       </w:r>
     </w:p>
     <w:p>
       <w:r>
-        <w:t>20. A family tendency may increase the likelihood of a trait, but does not guarantee it. The most precise word is ___.</w:t>
+        <w:t>20. Choose the expression that best fits the meaning and usage in this context.</w:t>
+        <w:br/>
+        <w:t>The family gathered at the church for the child’s ___. During the ceremony, the priest poured water over the child’s head.</w:t>
       </w:r>
     </w:p>
     <w:p>
@@ -919,7 +939,7 @@
         <w:spacing w:after="20"/>
       </w:pPr>
       <w:r>
-        <w:t>A. obligation</w:t>
+        <w:t>A. communion</w:t>
       </w:r>
     </w:p>
     <w:p>
@@ -927,7 +947,7 @@
         <w:spacing w:after="20"/>
       </w:pPr>
       <w:r>
-        <w:t>B. predisposition</w:t>
+        <w:t>B. baptism</w:t>
       </w:r>
     </w:p>
     <w:p>
@@ -935,7 +955,7 @@
         <w:spacing w:after="20"/>
       </w:pPr>
       <w:r>
-        <w:t>C. baptism</w:t>
+        <w:t>C. ordination</w:t>
       </w:r>
     </w:p>
     <w:p>
@@ -943,7 +963,7 @@
         <w:spacing w:after="20"/>
       </w:pPr>
       <w:r>
-        <w:t>D. superstition</w:t>
+        <w:t>D. confirmation</w:t>
       </w:r>
     </w:p>
     <w:p>
@@ -951,7 +971,7 @@
         <w:spacing w:after="20"/>
       </w:pPr>
       <w:r>
-        <w:t>E. entrance</w:t>
+        <w:t>E. wedding</w:t>
       </w:r>
     </w:p>
     <w:p>

</xml_diff>